<commit_message>
Add connection profiles and update docs
</commit_message>
<xml_diff>
--- a/docs/wfview-mac_操作説明書.docx
+++ b/docs/wfview-mac_操作説明書.docx
@@ -2,7 +2,7 @@
 <file path=word/document.xml><?xml version="1.0" encoding="utf-8"?>
 <w:document xmlns:w="http://schemas.openxmlformats.org/wordprocessingml/2006/main" xmlns:m="http://schemas.openxmlformats.org/officeDocument/2006/math" xmlns:r="http://schemas.openxmlformats.org/officeDocument/2006/relationships" xmlns:o="urn:schemas-microsoft-com:office:office" xmlns:v="urn:schemas-microsoft-com:vml" xmlns:w10="urn:schemas-microsoft-com:office:word" xmlns:a="http://schemas.openxmlformats.org/drawingml/2006/main" xmlns:pic="http://schemas.openxmlformats.org/drawingml/2006/picture" xmlns:wp="http://schemas.openxmlformats.org/drawingml/2006/wordprocessingDrawing">
   <w:body>
-    <w:bookmarkStart w:id="39" w:name="wfview-mac-操作説明書"/>
+    <w:bookmarkStart w:id="41" w:name="wfview-mac-操作説明書"/>
     <w:p>
       <w:pPr>
         <w:pStyle w:val="Heading1"/>
@@ -60,7 +60,7 @@
       </w:r>
     </w:p>
     <w:bookmarkEnd w:id="20"/>
-    <w:bookmarkStart w:id="21" w:name="起動と接続"/>
+    <w:bookmarkStart w:id="22" w:name="起動と接続"/>
     <w:p>
       <w:pPr>
         <w:pStyle w:val="Heading2"/>
@@ -87,7 +87,7 @@
         <w:t xml:space="preserve"> </w:t>
       </w:r>
       <w:r>
-        <w:t xml:space="preserve">を起動します。</w:t>
+        <w:t xml:space="preserve">を起動します。起動時はメイン画面が最大化されます。</w:t>
       </w:r>
     </w:p>
     <w:p>
@@ -191,8 +191,305 @@
         <w:t xml:space="preserve">接続後、無線機の対応機能に応じてボタンや設定項目が有効になります。対応していない機能は非表示または無効になります。</w:t>
       </w:r>
     </w:p>
+    <w:bookmarkStart w:id="21" w:name="接続プロファイル"/>
+    <w:p>
+      <w:pPr>
+        <w:pStyle w:val="Heading3"/>
+      </w:pPr>
+      <w:r>
+        <w:t xml:space="preserve">2.1 接続プロファイル</w:t>
+      </w:r>
+    </w:p>
+    <w:p>
+      <w:pPr>
+        <w:pStyle w:val="FirstParagraph"/>
+      </w:pPr>
+      <w:r>
+        <w:t xml:space="preserve">Settings の</w:t>
+      </w:r>
+      <w:r>
+        <w:t xml:space="preserve"> </w:t>
+      </w:r>
+      <w:r>
+        <w:rPr>
+          <w:rStyle w:val="VerbatimChar"/>
+        </w:rPr>
+        <w:t xml:space="preserve">Connection Profile</w:t>
+      </w:r>
+      <w:r>
+        <w:t xml:space="preserve"> </w:t>
+      </w:r>
+      <w:r>
+        <w:t xml:space="preserve">では、無線機ごとの接続設定を名前付きプロファイルとして複数保存できます。</w:t>
+      </w:r>
+      <w:r>
+        <w:t xml:space="preserve"> </w:t>
+      </w:r>
+      <w:r>
+        <w:t xml:space="preserve">自宅 LAN、リモート接続、USB シリアル接続などを切り替える場合に使用します。</w:t>
+      </w:r>
+    </w:p>
+    <w:p>
+      <w:pPr>
+        <w:pStyle w:val="BodyText"/>
+      </w:pPr>
+      <w:r>
+        <w:t xml:space="preserve">主な操作:</w:t>
+      </w:r>
+    </w:p>
+    <w:p>
+      <w:pPr>
+        <w:numPr>
+          <w:ilvl w:val="0"/>
+          <w:numId w:val="1002"/>
+        </w:numPr>
+        <w:pStyle w:val="Compact"/>
+      </w:pPr>
+      <w:r>
+        <w:t xml:space="preserve">プロファイル名を入力して</w:t>
+      </w:r>
+      <w:r>
+        <w:t xml:space="preserve"> </w:t>
+      </w:r>
+      <w:r>
+        <w:rPr>
+          <w:rStyle w:val="VerbatimChar"/>
+        </w:rPr>
+        <w:t xml:space="preserve">Save</w:t>
+      </w:r>
+      <w:r>
+        <w:t xml:space="preserve"> </w:t>
+      </w:r>
+      <w:r>
+        <w:t xml:space="preserve">を押すと、現在の接続設定を保存します。</w:t>
+      </w:r>
+    </w:p>
+    <w:p>
+      <w:pPr>
+        <w:numPr>
+          <w:ilvl w:val="0"/>
+          <w:numId w:val="1002"/>
+        </w:numPr>
+        <w:pStyle w:val="Compact"/>
+      </w:pPr>
+      <w:r>
+        <w:t xml:space="preserve">既存プロファイルを選択すると、保存されている接続情報が入力欄へコピー表示されます。</w:t>
+      </w:r>
+    </w:p>
+    <w:p>
+      <w:pPr>
+        <w:numPr>
+          <w:ilvl w:val="0"/>
+          <w:numId w:val="1002"/>
+        </w:numPr>
+        <w:pStyle w:val="Compact"/>
+      </w:pPr>
+      <w:r>
+        <w:t xml:space="preserve">同じ名前で</w:t>
+      </w:r>
+      <w:r>
+        <w:t xml:space="preserve"> </w:t>
+      </w:r>
+      <w:r>
+        <w:rPr>
+          <w:rStyle w:val="VerbatimChar"/>
+        </w:rPr>
+        <w:t xml:space="preserve">Save</w:t>
+      </w:r>
+      <w:r>
+        <w:t xml:space="preserve"> </w:t>
+      </w:r>
+      <w:r>
+        <w:t xml:space="preserve">を押すと、そのプロファイルを上書きします。</w:t>
+      </w:r>
+    </w:p>
+    <w:p>
+      <w:pPr>
+        <w:numPr>
+          <w:ilvl w:val="0"/>
+          <w:numId w:val="1002"/>
+        </w:numPr>
+        <w:pStyle w:val="Compact"/>
+      </w:pPr>
+      <w:r>
+        <w:rPr>
+          <w:rStyle w:val="VerbatimChar"/>
+        </w:rPr>
+        <w:t xml:space="preserve">Delete</w:t>
+      </w:r>
+      <w:r>
+        <w:t xml:space="preserve"> </w:t>
+      </w:r>
+      <w:r>
+        <w:t xml:space="preserve">を押すと、選択中のプロファイルを削除します。</w:t>
+      </w:r>
+    </w:p>
+    <w:p>
+      <w:pPr>
+        <w:numPr>
+          <w:ilvl w:val="0"/>
+          <w:numId w:val="1002"/>
+        </w:numPr>
+        <w:pStyle w:val="Compact"/>
+      </w:pPr>
+      <w:r>
+        <w:rPr>
+          <w:rStyle w:val="VerbatimChar"/>
+        </w:rPr>
+        <w:t xml:space="preserve">Connect</w:t>
+      </w:r>
+      <w:r>
+        <w:t xml:space="preserve"> </w:t>
+      </w:r>
+      <w:r>
+        <w:t xml:space="preserve">を押すと、選択中の保存済みプロファイルを読み込み直してから接続します。</w:t>
+      </w:r>
+    </w:p>
+    <w:p>
+      <w:pPr>
+        <w:pStyle w:val="FirstParagraph"/>
+      </w:pPr>
+      <w:r>
+        <w:t xml:space="preserve">保存される主な項目:</w:t>
+      </w:r>
+    </w:p>
+    <w:p>
+      <w:pPr>
+        <w:numPr>
+          <w:ilvl w:val="0"/>
+          <w:numId w:val="1003"/>
+        </w:numPr>
+        <w:pStyle w:val="Compact"/>
+      </w:pPr>
+      <w:r>
+        <w:t xml:space="preserve">メーカー、CI-V アドレス、PTT 種別。</w:t>
+      </w:r>
+    </w:p>
+    <w:p>
+      <w:pPr>
+        <w:numPr>
+          <w:ilvl w:val="0"/>
+          <w:numId w:val="1003"/>
+        </w:numPr>
+        <w:pStyle w:val="Compact"/>
+      </w:pPr>
+      <w:r>
+        <w:t xml:space="preserve">シリアルポート、ボーレート、仮想シリアルポート。</w:t>
+      </w:r>
+    </w:p>
+    <w:p>
+      <w:pPr>
+        <w:numPr>
+          <w:ilvl w:val="0"/>
+          <w:numId w:val="1003"/>
+        </w:numPr>
+        <w:pStyle w:val="Compact"/>
+      </w:pPr>
+      <w:r>
+        <w:t xml:space="preserve">LAN 有効 / 無効、IP アドレス、Control / CAT / Audio / Scope ポート。</w:t>
+      </w:r>
+    </w:p>
+    <w:p>
+      <w:pPr>
+        <w:numPr>
+          <w:ilvl w:val="0"/>
+          <w:numId w:val="1003"/>
+        </w:numPr>
+        <w:pStyle w:val="Compact"/>
+      </w:pPr>
+      <w:r>
+        <w:t xml:space="preserve">接続タイプ、ユーザー名、管理者ログイン、Half Duplex。</w:t>
+      </w:r>
+    </w:p>
+    <w:p>
+      <w:pPr>
+        <w:numPr>
+          <w:ilvl w:val="0"/>
+          <w:numId w:val="1003"/>
+        </w:numPr>
+        <w:pStyle w:val="Compact"/>
+      </w:pPr>
+      <w:r>
+        <w:t xml:space="preserve">音声入出力、サンプルレート、コーデック、レイテンシ。</w:t>
+      </w:r>
+    </w:p>
+    <w:p>
+      <w:pPr>
+        <w:pStyle w:val="FirstParagraph"/>
+      </w:pPr>
+      <w:r>
+        <w:t xml:space="preserve">注意:</w:t>
+      </w:r>
+    </w:p>
+    <w:p>
+      <w:pPr>
+        <w:numPr>
+          <w:ilvl w:val="0"/>
+          <w:numId w:val="1004"/>
+        </w:numPr>
+        <w:pStyle w:val="Compact"/>
+      </w:pPr>
+      <w:r>
+        <w:t xml:space="preserve">プロファイルを選択しただけでは無線機へ接続しません。接続するには</w:t>
+      </w:r>
+      <w:r>
+        <w:t xml:space="preserve"> </w:t>
+      </w:r>
+      <w:r>
+        <w:rPr>
+          <w:rStyle w:val="VerbatimChar"/>
+        </w:rPr>
+        <w:t xml:space="preserve">Connect</w:t>
+      </w:r>
+      <w:r>
+        <w:t xml:space="preserve"> </w:t>
+      </w:r>
+      <w:r>
+        <w:t xml:space="preserve">を押します。</w:t>
+      </w:r>
+    </w:p>
+    <w:p>
+      <w:pPr>
+        <w:numPr>
+          <w:ilvl w:val="0"/>
+          <w:numId w:val="1004"/>
+        </w:numPr>
+        <w:pStyle w:val="Compact"/>
+      </w:pPr>
+      <w:r>
+        <w:t xml:space="preserve">入力欄を変更した後にその内容を残したい場合は、プロファイル名を確認して</w:t>
+      </w:r>
+      <w:r>
+        <w:t xml:space="preserve"> </w:t>
+      </w:r>
+      <w:r>
+        <w:rPr>
+          <w:rStyle w:val="VerbatimChar"/>
+        </w:rPr>
+        <w:t xml:space="preserve">Save</w:t>
+      </w:r>
+      <w:r>
+        <w:t xml:space="preserve"> </w:t>
+      </w:r>
+      <w:r>
+        <w:t xml:space="preserve">を押してください。</w:t>
+      </w:r>
+    </w:p>
+    <w:p>
+      <w:pPr>
+        <w:numPr>
+          <w:ilvl w:val="0"/>
+          <w:numId w:val="1004"/>
+        </w:numPr>
+        <w:pStyle w:val="Compact"/>
+      </w:pPr>
+      <w:r>
+        <w:t xml:space="preserve">パスワードはプロファイルに保存されます。共有 PC では取り扱いに注意してください。</w:t>
+      </w:r>
+    </w:p>
     <w:bookmarkEnd w:id="21"/>
-    <w:bookmarkStart w:id="22" w:name="メイン画面の主なボタン"/>
+    <w:bookmarkEnd w:id="22"/>
+    <w:bookmarkStart w:id="23" w:name="メイン画面の主なボタン"/>
     <w:p>
       <w:pPr>
         <w:pStyle w:val="Heading2"/>
@@ -499,8 +796,8 @@
         <w:t xml:space="preserve">主要操作ボタンは角丸表示に変更されています。</w:t>
       </w:r>
     </w:p>
-    <w:bookmarkEnd w:id="22"/>
-    <w:bookmarkStart w:id="26" w:name="周波数操作"/>
+    <w:bookmarkEnd w:id="23"/>
+    <w:bookmarkStart w:id="28" w:name="周波数操作"/>
     <w:p>
       <w:pPr>
         <w:pStyle w:val="Heading2"/>
@@ -509,7 +806,7 @@
         <w:t xml:space="preserve">4. 周波数操作</w:t>
       </w:r>
     </w:p>
-    <w:bookmarkStart w:id="23" w:name="周波数表示の桁クリック"/>
+    <w:bookmarkStart w:id="24" w:name="周波数表示の桁クリック"/>
     <w:p>
       <w:pPr>
         <w:pStyle w:val="Heading3"/>
@@ -538,7 +835,7 @@
       <w:pPr>
         <w:numPr>
           <w:ilvl w:val="0"/>
-          <w:numId w:val="1002"/>
+          <w:numId w:val="1005"/>
         </w:numPr>
         <w:pStyle w:val="Compact"/>
       </w:pPr>
@@ -580,7 +877,7 @@
       <w:pPr>
         <w:numPr>
           <w:ilvl w:val="0"/>
-          <w:numId w:val="1002"/>
+          <w:numId w:val="1005"/>
         </w:numPr>
         <w:pStyle w:val="Compact"/>
       </w:pPr>
@@ -622,7 +919,7 @@
       <w:pPr>
         <w:numPr>
           <w:ilvl w:val="0"/>
-          <w:numId w:val="1002"/>
+          <w:numId w:val="1005"/>
         </w:numPr>
         <w:pStyle w:val="Compact"/>
       </w:pPr>
@@ -668,8 +965,8 @@
         <w:t xml:space="preserve">従来のダイアル下のステップ周波数プルダウンは表示されません。ステップ選択は周波数表示の桁クリックで行います。</w:t>
       </w:r>
     </w:p>
-    <w:bookmarkEnd w:id="23"/>
-    <w:bookmarkStart w:id="24" w:name="vfo-横の周波数アップ-ダウンボタン"/>
+    <w:bookmarkEnd w:id="24"/>
+    <w:bookmarkStart w:id="25" w:name="vfo-横の周波数アップ-ダウンボタン"/>
     <w:p>
       <w:pPr>
         <w:pStyle w:val="Heading3"/>
@@ -720,7 +1017,7 @@
       <w:pPr>
         <w:numPr>
           <w:ilvl w:val="0"/>
-          <w:numId w:val="1003"/>
+          <w:numId w:val="1006"/>
         </w:numPr>
         <w:pStyle w:val="Compact"/>
       </w:pPr>
@@ -738,7 +1035,7 @@
       <w:pPr>
         <w:numPr>
           <w:ilvl w:val="0"/>
-          <w:numId w:val="1003"/>
+          <w:numId w:val="1006"/>
         </w:numPr>
         <w:pStyle w:val="Compact"/>
       </w:pPr>
@@ -759,22 +1056,112 @@
       <w:r>
         <w:t xml:space="preserve">最後にクリックした周波数表示の桁が、これらのボタンのステップ幅になります。</w:t>
       </w:r>
-    </w:p>
-    <w:bookmarkEnd w:id="24"/>
-    <w:bookmarkStart w:id="25" w:name="vfo-操作"/>
+      <w:r>
+        <w:t xml:space="preserve"> </w:t>
+      </w:r>
+      <w:r>
+        <w:rPr>
+          <w:rStyle w:val="VerbatimChar"/>
+        </w:rPr>
+        <w:t xml:space="preserve">▼</w:t>
+      </w:r>
+      <w:r>
+        <w:t xml:space="preserve"> </w:t>
+      </w:r>
+      <w:r>
+        <w:t xml:space="preserve">/</w:t>
+      </w:r>
+      <w:r>
+        <w:t xml:space="preserve"> </w:t>
+      </w:r>
+      <w:r>
+        <w:rPr>
+          <w:rStyle w:val="VerbatimChar"/>
+        </w:rPr>
+        <w:t xml:space="preserve">▲</w:t>
+      </w:r>
+      <w:r>
+        <w:t xml:space="preserve"> </w:t>
+      </w:r>
+      <w:r>
+        <w:t xml:space="preserve">を押したままにすると、選択中のステップ幅で連続して周波数が変化します。</w:t>
+      </w:r>
+      <w:r>
+        <w:t xml:space="preserve"> </w:t>
+      </w:r>
+      <w:r>
+        <w:t xml:space="preserve">周波数ロック中は</w:t>
+      </w:r>
+      <w:r>
+        <w:t xml:space="preserve"> </w:t>
+      </w:r>
+      <w:r>
+        <w:rPr>
+          <w:rStyle w:val="VerbatimChar"/>
+        </w:rPr>
+        <w:t xml:space="preserve">▼</w:t>
+      </w:r>
+      <w:r>
+        <w:t xml:space="preserve"> </w:t>
+      </w:r>
+      <w:r>
+        <w:t xml:space="preserve">/</w:t>
+      </w:r>
+      <w:r>
+        <w:t xml:space="preserve"> </w:t>
+      </w:r>
+      <w:r>
+        <w:rPr>
+          <w:rStyle w:val="VerbatimChar"/>
+        </w:rPr>
+        <w:t xml:space="preserve">▲</w:t>
+      </w:r>
+      <w:r>
+        <w:t xml:space="preserve"> </w:t>
+      </w:r>
+      <w:r>
+        <w:t xml:space="preserve">ボタンがグレーアウトし、周波数変更はできません。</w:t>
+      </w:r>
+    </w:p>
+    <w:bookmarkEnd w:id="25"/>
+    <w:bookmarkStart w:id="26" w:name="周波数入力とバンド選択ポップアップ"/>
     <w:p>
       <w:pPr>
         <w:pStyle w:val="Heading3"/>
       </w:pPr>
       <w:r>
-        <w:t xml:space="preserve">4.3 VFO 操作</w:t>
-      </w:r>
-    </w:p>
-    <w:p>
-      <w:pPr>
-        <w:numPr>
-          <w:ilvl w:val="0"/>
-          <w:numId w:val="1004"/>
+        <w:t xml:space="preserve">4.3 周波数入力とバンド選択ポップアップ</w:t>
+      </w:r>
+    </w:p>
+    <w:p>
+      <w:pPr>
+        <w:pStyle w:val="FirstParagraph"/>
+      </w:pPr>
+      <w:r>
+        <w:t xml:space="preserve">周波数入力ポップアップとバンド選択ポップアップは、メイン画面上で扱いやすいように小型化されています。</w:t>
+      </w:r>
+      <w:r>
+        <w:t xml:space="preserve"> </w:t>
+      </w:r>
+      <w:r>
+        <w:t xml:space="preserve">バンド選択ボタンもコンパクトなサイズで表示されます。</w:t>
+      </w:r>
+    </w:p>
+    <w:bookmarkEnd w:id="26"/>
+    <w:bookmarkStart w:id="27" w:name="vfo-操作"/>
+    <w:p>
+      <w:pPr>
+        <w:pStyle w:val="Heading3"/>
+      </w:pPr>
+      <w:r>
+        <w:t xml:space="preserve">4.4 VFO 操作</w:t>
+      </w:r>
+    </w:p>
+    <w:p>
+      <w:pPr>
+        <w:numPr>
+          <w:ilvl w:val="0"/>
+          <w:numId w:val="1007"/>
         </w:numPr>
         <w:pStyle w:val="Compact"/>
       </w:pPr>
@@ -807,7 +1194,7 @@
       <w:pPr>
         <w:numPr>
           <w:ilvl w:val="0"/>
-          <w:numId w:val="1004"/>
+          <w:numId w:val="1007"/>
         </w:numPr>
         <w:pStyle w:val="Compact"/>
       </w:pPr>
@@ -825,7 +1212,7 @@
       <w:pPr>
         <w:numPr>
           <w:ilvl w:val="0"/>
-          <w:numId w:val="1004"/>
+          <w:numId w:val="1007"/>
         </w:numPr>
         <w:pStyle w:val="Compact"/>
       </w:pPr>
@@ -843,7 +1230,7 @@
       <w:pPr>
         <w:numPr>
           <w:ilvl w:val="0"/>
-          <w:numId w:val="1004"/>
+          <w:numId w:val="1007"/>
         </w:numPr>
         <w:pStyle w:val="Compact"/>
       </w:pPr>
@@ -861,7 +1248,7 @@
       <w:pPr>
         <w:numPr>
           <w:ilvl w:val="0"/>
-          <w:numId w:val="1004"/>
+          <w:numId w:val="1007"/>
         </w:numPr>
         <w:pStyle w:val="Compact"/>
       </w:pPr>
@@ -883,9 +1270,9 @@
         <w:t xml:space="preserve">表示されるボタンは、接続した無線機の対応機能によって変わります。</w:t>
       </w:r>
     </w:p>
-    <w:bookmarkEnd w:id="25"/>
-    <w:bookmarkEnd w:id="26"/>
-    <w:bookmarkStart w:id="29" w:name="ウォーターフォールとスコープ"/>
+    <w:bookmarkEnd w:id="27"/>
+    <w:bookmarkEnd w:id="28"/>
+    <w:bookmarkStart w:id="31" w:name="ウォーターフォールとスコープ"/>
     <w:p>
       <w:pPr>
         <w:pStyle w:val="Heading2"/>
@@ -894,7 +1281,7 @@
         <w:t xml:space="preserve">5. ウォーターフォールとスコープ</w:t>
       </w:r>
     </w:p>
-    <w:bookmarkStart w:id="27" w:name="wf-スライダー"/>
+    <w:bookmarkStart w:id="29" w:name="wf-スライダー"/>
     <w:p>
       <w:pPr>
         <w:pStyle w:val="Heading3"/>
@@ -936,7 +1323,7 @@
       <w:pPr>
         <w:numPr>
           <w:ilvl w:val="0"/>
-          <w:numId w:val="1005"/>
+          <w:numId w:val="1008"/>
         </w:numPr>
         <w:pStyle w:val="Compact"/>
       </w:pPr>
@@ -948,7 +1335,7 @@
       <w:pPr>
         <w:numPr>
           <w:ilvl w:val="0"/>
-          <w:numId w:val="1005"/>
+          <w:numId w:val="1008"/>
         </w:numPr>
         <w:pStyle w:val="Compact"/>
       </w:pPr>
@@ -960,7 +1347,7 @@
       <w:pPr>
         <w:numPr>
           <w:ilvl w:val="0"/>
-          <w:numId w:val="1005"/>
+          <w:numId w:val="1008"/>
         </w:numPr>
         <w:pStyle w:val="Compact"/>
       </w:pPr>
@@ -968,8 +1355,8 @@
         <w:t xml:space="preserve">値は保存され、次回起動時にも反映されます。</w:t>
       </w:r>
     </w:p>
-    <w:bookmarkEnd w:id="27"/>
-    <w:bookmarkStart w:id="28" w:name="スコープ操作"/>
+    <w:bookmarkEnd w:id="29"/>
+    <w:bookmarkStart w:id="30" w:name="スコープ操作"/>
     <w:p>
       <w:pPr>
         <w:pStyle w:val="Heading3"/>
@@ -992,9 +1379,9 @@
         <w:t xml:space="preserve">ウォーターフォールやスペクトラムの表示内容は、無線機のスコープ対応状況と設定に依存します。</w:t>
       </w:r>
     </w:p>
-    <w:bookmarkEnd w:id="28"/>
-    <w:bookmarkEnd w:id="29"/>
-    <w:bookmarkStart w:id="33" w:name="送信関連操作"/>
+    <w:bookmarkEnd w:id="30"/>
+    <w:bookmarkEnd w:id="31"/>
+    <w:bookmarkStart w:id="35" w:name="送信関連操作"/>
     <w:p>
       <w:pPr>
         <w:pStyle w:val="Heading2"/>
@@ -1003,7 +1390,7 @@
         <w:t xml:space="preserve">6. 送信関連操作</w:t>
       </w:r>
     </w:p>
-    <w:bookmarkStart w:id="30" w:name="送信"/>
+    <w:bookmarkStart w:id="32" w:name="送信"/>
     <w:p>
       <w:pPr>
         <w:pStyle w:val="Heading3"/>
@@ -1094,7 +1481,7 @@
       <w:pPr>
         <w:numPr>
           <w:ilvl w:val="0"/>
-          <w:numId w:val="1006"/>
+          <w:numId w:val="1009"/>
         </w:numPr>
         <w:pStyle w:val="Compact"/>
       </w:pPr>
@@ -1106,7 +1493,7 @@
       <w:pPr>
         <w:numPr>
           <w:ilvl w:val="0"/>
-          <w:numId w:val="1006"/>
+          <w:numId w:val="1009"/>
         </w:numPr>
         <w:pStyle w:val="Compact"/>
       </w:pPr>
@@ -1118,7 +1505,7 @@
       <w:pPr>
         <w:numPr>
           <w:ilvl w:val="0"/>
-          <w:numId w:val="1006"/>
+          <w:numId w:val="1009"/>
         </w:numPr>
         <w:pStyle w:val="Compact"/>
       </w:pPr>
@@ -1130,7 +1517,7 @@
       <w:pPr>
         <w:numPr>
           <w:ilvl w:val="0"/>
-          <w:numId w:val="1006"/>
+          <w:numId w:val="1009"/>
         </w:numPr>
         <w:pStyle w:val="Compact"/>
       </w:pPr>
@@ -1142,7 +1529,7 @@
       <w:pPr>
         <w:numPr>
           <w:ilvl w:val="0"/>
-          <w:numId w:val="1006"/>
+          <w:numId w:val="1009"/>
         </w:numPr>
         <w:pStyle w:val="Compact"/>
       </w:pPr>
@@ -1150,8 +1537,8 @@
         <w:t xml:space="preserve">無線局の運用条件に合っていること。</w:t>
       </w:r>
     </w:p>
-    <w:bookmarkEnd w:id="30"/>
-    <w:bookmarkStart w:id="31" w:name="tune"/>
+    <w:bookmarkEnd w:id="32"/>
+    <w:bookmarkStart w:id="33" w:name="tune"/>
     <w:p>
       <w:pPr>
         <w:pStyle w:val="Heading3"/>
@@ -1198,8 +1585,8 @@
         <w:t xml:space="preserve">チューニング時は送信状態になることがあるため、必ず接続先と出力条件を確認してください。</w:t>
       </w:r>
     </w:p>
-    <w:bookmarkEnd w:id="31"/>
-    <w:bookmarkStart w:id="32" w:name="cw"/>
+    <w:bookmarkEnd w:id="33"/>
+    <w:bookmarkStart w:id="34" w:name="cw"/>
     <w:p>
       <w:pPr>
         <w:pStyle w:val="Heading3"/>
@@ -1231,9 +1618,9 @@
         <w:t xml:space="preserve">マクロやテキスト送信を行う場合は、送信前に速度、サイドトーン、送信先 VFO、モードを確認してください。</w:t>
       </w:r>
     </w:p>
-    <w:bookmarkEnd w:id="32"/>
-    <w:bookmarkEnd w:id="33"/>
-    <w:bookmarkStart w:id="34" w:name="レピータ-スプリット"/>
+    <w:bookmarkEnd w:id="34"/>
+    <w:bookmarkEnd w:id="35"/>
+    <w:bookmarkStart w:id="36" w:name="レピータ-スプリット"/>
     <w:p>
       <w:pPr>
         <w:pStyle w:val="Heading2"/>
@@ -1271,7 +1658,7 @@
       <w:pPr>
         <w:numPr>
           <w:ilvl w:val="0"/>
-          <w:numId w:val="1007"/>
+          <w:numId w:val="1010"/>
         </w:numPr>
         <w:pStyle w:val="Compact"/>
       </w:pPr>
@@ -1283,7 +1670,7 @@
       <w:pPr>
         <w:numPr>
           <w:ilvl w:val="0"/>
-          <w:numId w:val="1007"/>
+          <w:numId w:val="1010"/>
         </w:numPr>
         <w:pStyle w:val="Compact"/>
       </w:pPr>
@@ -1295,7 +1682,7 @@
       <w:pPr>
         <w:numPr>
           <w:ilvl w:val="0"/>
-          <w:numId w:val="1007"/>
+          <w:numId w:val="1010"/>
         </w:numPr>
         <w:pStyle w:val="Compact"/>
       </w:pPr>
@@ -1307,7 +1694,7 @@
       <w:pPr>
         <w:numPr>
           <w:ilvl w:val="0"/>
-          <w:numId w:val="1007"/>
+          <w:numId w:val="1010"/>
         </w:numPr>
         <w:pStyle w:val="Compact"/>
       </w:pPr>
@@ -1323,8 +1710,8 @@
         <w:t xml:space="preserve">無線機によって対応範囲が異なります。</w:t>
       </w:r>
     </w:p>
-    <w:bookmarkEnd w:id="34"/>
-    <w:bookmarkStart w:id="35" w:name="メモリーモード"/>
+    <w:bookmarkEnd w:id="36"/>
+    <w:bookmarkStart w:id="37" w:name="メモリーモード"/>
     <w:p>
       <w:pPr>
         <w:pStyle w:val="Heading2"/>
@@ -1379,8 +1766,8 @@
         <w:t xml:space="preserve">ボタンが表示されている場合は、VFO モードとメモリーモードを切り替えられます。</w:t>
       </w:r>
     </w:p>
-    <w:bookmarkEnd w:id="35"/>
-    <w:bookmarkStart w:id="36" w:name="終了"/>
+    <w:bookmarkEnd w:id="37"/>
+    <w:bookmarkStart w:id="38" w:name="終了"/>
     <w:p>
       <w:pPr>
         <w:pStyle w:val="Heading2"/>
@@ -1393,7 +1780,7 @@
       <w:pPr>
         <w:numPr>
           <w:ilvl w:val="0"/>
-          <w:numId w:val="1008"/>
+          <w:numId w:val="1011"/>
         </w:numPr>
         <w:pStyle w:val="Compact"/>
       </w:pPr>
@@ -1405,7 +1792,7 @@
       <w:pPr>
         <w:numPr>
           <w:ilvl w:val="0"/>
-          <w:numId w:val="1008"/>
+          <w:numId w:val="1011"/>
         </w:numPr>
         <w:pStyle w:val="Compact"/>
       </w:pPr>
@@ -1432,7 +1819,7 @@
       <w:pPr>
         <w:numPr>
           <w:ilvl w:val="0"/>
-          <w:numId w:val="1008"/>
+          <w:numId w:val="1011"/>
         </w:numPr>
         <w:pStyle w:val="Compact"/>
       </w:pPr>
@@ -1448,8 +1835,8 @@
         <w:t xml:space="preserve">この版では、終了時に発生していた Qt audio 系のクラッシュを回避する修正が入っています。</w:t>
       </w:r>
     </w:p>
-    <w:bookmarkEnd w:id="36"/>
-    <w:bookmarkStart w:id="37" w:name="トラブルシューティング"/>
+    <w:bookmarkEnd w:id="38"/>
+    <w:bookmarkStart w:id="39" w:name="トラブルシューティング"/>
     <w:p>
       <w:pPr>
         <w:pStyle w:val="Heading2"/>
@@ -1688,8 +2075,8 @@
         </w:tc>
       </w:tr>
     </w:tbl>
-    <w:bookmarkEnd w:id="37"/>
-    <w:bookmarkStart w:id="38" w:name="安全上の注意"/>
+    <w:bookmarkEnd w:id="39"/>
+    <w:bookmarkStart w:id="40" w:name="安全上の注意"/>
     <w:p>
       <w:pPr>
         <w:pStyle w:val="Heading2"/>
@@ -1712,8 +2099,8 @@
         <w:t xml:space="preserve">送信、TUNE、CW、スプリット、レピータ設定を操作する前に、必ず周波数、出力、アンテナ、免許条件、周囲への影響を確認してください。</w:t>
       </w:r>
     </w:p>
-    <w:bookmarkEnd w:id="38"/>
-    <w:bookmarkEnd w:id="39"/>
+    <w:bookmarkEnd w:id="40"/>
+    <w:bookmarkEnd w:id="41"/>
     <w:sectPr/>
   </w:body>
 </w:document>
@@ -2033,6 +2420,15 @@
     <w:abstractNumId w:val="991"/>
   </w:num>
   <w:num w:numId="1008">
+    <w:abstractNumId w:val="991"/>
+  </w:num>
+  <w:num w:numId="1009">
+    <w:abstractNumId w:val="991"/>
+  </w:num>
+  <w:num w:numId="1010">
+    <w:abstractNumId w:val="991"/>
+  </w:num>
+  <w:num w:numId="1011">
     <w:abstractNumId w:val="99411"/>
     <w:lvlOverride w:ilvl="0">
       <w:startOverride w:val="1"/>
@@ -2532,7 +2928,7 @@
       <w:color w:themeColor="accent1" w:themeShade="BF" w:val="365F91"/>
     </w:rPr>
   </w:style>
-  <w:style w:type="paragraph" w:customStyle="1" w:styleId="SourceCode">
+  <w:style w:customStyle="1" w:styleId="SourceCode" w:type="paragraph">
     <w:name w:val="Source Code"/>
     <w:basedOn w:val="Normal"/>
     <w:link w:val="VerbatimChar"/>
@@ -2540,7 +2936,7 @@
       <w:wordWrap w:val="off"/>
     </w:pPr>
   </w:style>
-  <w:style w:type="character" w:customStyle="1" w:styleId="KeywordTok">
+  <w:style w:customStyle="1" w:styleId="KeywordTok" w:type="character">
     <w:name w:val="KeywordTok"/>
     <w:basedOn w:val="VerbatimChar"/>
     <w:rPr>
@@ -2548,82 +2944,82 @@
       <w:b/>
     </w:rPr>
   </w:style>
-  <w:style w:type="character" w:customStyle="1" w:styleId="DataTypeTok">
+  <w:style w:customStyle="1" w:styleId="DataTypeTok" w:type="character">
     <w:name w:val="DataTypeTok"/>
     <w:basedOn w:val="VerbatimChar"/>
     <w:rPr>
       <w:color w:val="902000"/>
     </w:rPr>
   </w:style>
-  <w:style w:type="character" w:customStyle="1" w:styleId="DecValTok">
+  <w:style w:customStyle="1" w:styleId="DecValTok" w:type="character">
     <w:name w:val="DecValTok"/>
     <w:basedOn w:val="VerbatimChar"/>
     <w:rPr>
       <w:color w:val="40a070"/>
     </w:rPr>
   </w:style>
-  <w:style w:type="character" w:customStyle="1" w:styleId="BaseNTok">
+  <w:style w:customStyle="1" w:styleId="BaseNTok" w:type="character">
     <w:name w:val="BaseNTok"/>
     <w:basedOn w:val="VerbatimChar"/>
     <w:rPr>
       <w:color w:val="40a070"/>
     </w:rPr>
   </w:style>
-  <w:style w:type="character" w:customStyle="1" w:styleId="FloatTok">
+  <w:style w:customStyle="1" w:styleId="FloatTok" w:type="character">
     <w:name w:val="FloatTok"/>
     <w:basedOn w:val="VerbatimChar"/>
     <w:rPr>
       <w:color w:val="40a070"/>
     </w:rPr>
   </w:style>
-  <w:style w:type="character" w:customStyle="1" w:styleId="ConstantTok">
+  <w:style w:customStyle="1" w:styleId="ConstantTok" w:type="character">
     <w:name w:val="ConstantTok"/>
     <w:basedOn w:val="VerbatimChar"/>
     <w:rPr>
       <w:color w:val="880000"/>
     </w:rPr>
   </w:style>
-  <w:style w:type="character" w:customStyle="1" w:styleId="CharTok">
+  <w:style w:customStyle="1" w:styleId="CharTok" w:type="character">
     <w:name w:val="CharTok"/>
     <w:basedOn w:val="VerbatimChar"/>
     <w:rPr>
       <w:color w:val="4070a0"/>
     </w:rPr>
   </w:style>
-  <w:style w:type="character" w:customStyle="1" w:styleId="SpecialCharTok">
+  <w:style w:customStyle="1" w:styleId="SpecialCharTok" w:type="character">
     <w:name w:val="SpecialCharTok"/>
     <w:basedOn w:val="VerbatimChar"/>
     <w:rPr>
       <w:color w:val="4070a0"/>
     </w:rPr>
   </w:style>
-  <w:style w:type="character" w:customStyle="1" w:styleId="StringTok">
+  <w:style w:customStyle="1" w:styleId="StringTok" w:type="character">
     <w:name w:val="StringTok"/>
     <w:basedOn w:val="VerbatimChar"/>
     <w:rPr>
       <w:color w:val="4070a0"/>
     </w:rPr>
   </w:style>
-  <w:style w:type="character" w:customStyle="1" w:styleId="VerbatimStringTok">
+  <w:style w:customStyle="1" w:styleId="VerbatimStringTok" w:type="character">
     <w:name w:val="VerbatimStringTok"/>
     <w:basedOn w:val="VerbatimChar"/>
     <w:rPr>
       <w:color w:val="4070a0"/>
     </w:rPr>
   </w:style>
-  <w:style w:type="character" w:customStyle="1" w:styleId="SpecialStringTok">
+  <w:style w:customStyle="1" w:styleId="SpecialStringTok" w:type="character">
     <w:name w:val="SpecialStringTok"/>
     <w:basedOn w:val="VerbatimChar"/>
     <w:rPr>
       <w:color w:val="bb6688"/>
     </w:rPr>
   </w:style>
-  <w:style w:type="character" w:customStyle="1" w:styleId="ImportTok">
+  <w:style w:customStyle="1" w:styleId="ImportTok" w:type="character">
     <w:name w:val="ImportTok"/>
     <w:basedOn w:val="VerbatimChar"/>
     <w:rPr/>
   </w:style>
-  <w:style w:type="character" w:customStyle="1" w:styleId="CommentTok">
+  <w:style w:customStyle="1" w:styleId="CommentTok" w:type="character">
     <w:name w:val="CommentTok"/>
     <w:basedOn w:val="VerbatimChar"/>
     <w:rPr>
@@ -2631,7 +3027,7 @@
       <w:i/>
     </w:rPr>
   </w:style>
-  <w:style w:type="character" w:customStyle="1" w:styleId="DocumentationTok">
+  <w:style w:customStyle="1" w:styleId="DocumentationTok" w:type="character">
     <w:name w:val="DocumentationTok"/>
     <w:basedOn w:val="VerbatimChar"/>
     <w:rPr>
@@ -2639,7 +3035,7 @@
       <w:i/>
     </w:rPr>
   </w:style>
-  <w:style w:type="character" w:customStyle="1" w:styleId="AnnotationTok">
+  <w:style w:customStyle="1" w:styleId="AnnotationTok" w:type="character">
     <w:name w:val="AnnotationTok"/>
     <w:basedOn w:val="VerbatimChar"/>
     <w:rPr>
@@ -2648,7 +3044,7 @@
       <w:i/>
     </w:rPr>
   </w:style>
-  <w:style w:type="character" w:customStyle="1" w:styleId="CommentVarTok">
+  <w:style w:customStyle="1" w:styleId="CommentVarTok" w:type="character">
     <w:name w:val="CommentVarTok"/>
     <w:basedOn w:val="VerbatimChar"/>
     <w:rPr>
@@ -2657,28 +3053,28 @@
       <w:i/>
     </w:rPr>
   </w:style>
-  <w:style w:type="character" w:customStyle="1" w:styleId="OtherTok">
+  <w:style w:customStyle="1" w:styleId="OtherTok" w:type="character">
     <w:name w:val="OtherTok"/>
     <w:basedOn w:val="VerbatimChar"/>
     <w:rPr>
       <w:color w:val="007020"/>
     </w:rPr>
   </w:style>
-  <w:style w:type="character" w:customStyle="1" w:styleId="FunctionTok">
+  <w:style w:customStyle="1" w:styleId="FunctionTok" w:type="character">
     <w:name w:val="FunctionTok"/>
     <w:basedOn w:val="VerbatimChar"/>
     <w:rPr>
       <w:color w:val="06287e"/>
     </w:rPr>
   </w:style>
-  <w:style w:type="character" w:customStyle="1" w:styleId="VariableTok">
+  <w:style w:customStyle="1" w:styleId="VariableTok" w:type="character">
     <w:name w:val="VariableTok"/>
     <w:basedOn w:val="VerbatimChar"/>
     <w:rPr>
       <w:color w:val="19177c"/>
     </w:rPr>
   </w:style>
-  <w:style w:type="character" w:customStyle="1" w:styleId="ControlFlowTok">
+  <w:style w:customStyle="1" w:styleId="ControlFlowTok" w:type="character">
     <w:name w:val="ControlFlowTok"/>
     <w:basedOn w:val="VerbatimChar"/>
     <w:rPr>
@@ -2686,43 +3082,43 @@
       <w:b/>
     </w:rPr>
   </w:style>
-  <w:style w:type="character" w:customStyle="1" w:styleId="OperatorTok">
+  <w:style w:customStyle="1" w:styleId="OperatorTok" w:type="character">
     <w:name w:val="OperatorTok"/>
     <w:basedOn w:val="VerbatimChar"/>
     <w:rPr>
       <w:color w:val="666666"/>
     </w:rPr>
   </w:style>
-  <w:style w:type="character" w:customStyle="1" w:styleId="BuiltInTok">
+  <w:style w:customStyle="1" w:styleId="BuiltInTok" w:type="character">
     <w:name w:val="BuiltInTok"/>
     <w:basedOn w:val="VerbatimChar"/>
     <w:rPr/>
   </w:style>
-  <w:style w:type="character" w:customStyle="1" w:styleId="ExtensionTok">
+  <w:style w:customStyle="1" w:styleId="ExtensionTok" w:type="character">
     <w:name w:val="ExtensionTok"/>
     <w:basedOn w:val="VerbatimChar"/>
     <w:rPr/>
   </w:style>
-  <w:style w:type="character" w:customStyle="1" w:styleId="PreprocessorTok">
+  <w:style w:customStyle="1" w:styleId="PreprocessorTok" w:type="character">
     <w:name w:val="PreprocessorTok"/>
     <w:basedOn w:val="VerbatimChar"/>
     <w:rPr>
       <w:color w:val="bc7a00"/>
     </w:rPr>
   </w:style>
-  <w:style w:type="character" w:customStyle="1" w:styleId="AttributeTok">
+  <w:style w:customStyle="1" w:styleId="AttributeTok" w:type="character">
     <w:name w:val="AttributeTok"/>
     <w:basedOn w:val="VerbatimChar"/>
     <w:rPr>
       <w:color w:val="7d9029"/>
     </w:rPr>
   </w:style>
-  <w:style w:type="character" w:customStyle="1" w:styleId="RegionMarkerTok">
+  <w:style w:customStyle="1" w:styleId="RegionMarkerTok" w:type="character">
     <w:name w:val="RegionMarkerTok"/>
     <w:basedOn w:val="VerbatimChar"/>
     <w:rPr/>
   </w:style>
-  <w:style w:type="character" w:customStyle="1" w:styleId="InformationTok">
+  <w:style w:customStyle="1" w:styleId="InformationTok" w:type="character">
     <w:name w:val="InformationTok"/>
     <w:basedOn w:val="VerbatimChar"/>
     <w:rPr>
@@ -2731,7 +3127,7 @@
       <w:i/>
     </w:rPr>
   </w:style>
-  <w:style w:type="character" w:customStyle="1" w:styleId="WarningTok">
+  <w:style w:customStyle="1" w:styleId="WarningTok" w:type="character">
     <w:name w:val="WarningTok"/>
     <w:basedOn w:val="VerbatimChar"/>
     <w:rPr>
@@ -2740,7 +3136,7 @@
       <w:i/>
     </w:rPr>
   </w:style>
-  <w:style w:type="character" w:customStyle="1" w:styleId="AlertTok">
+  <w:style w:customStyle="1" w:styleId="AlertTok" w:type="character">
     <w:name w:val="AlertTok"/>
     <w:basedOn w:val="VerbatimChar"/>
     <w:rPr>
@@ -2748,7 +3144,7 @@
       <w:b/>
     </w:rPr>
   </w:style>
-  <w:style w:type="character" w:customStyle="1" w:styleId="ErrorTok">
+  <w:style w:customStyle="1" w:styleId="ErrorTok" w:type="character">
     <w:name w:val="ErrorTok"/>
     <w:basedOn w:val="VerbatimChar"/>
     <w:rPr>
@@ -2756,7 +3152,7 @@
       <w:b/>
     </w:rPr>
   </w:style>
-  <w:style w:type="character" w:customStyle="1" w:styleId="NormalTok">
+  <w:style w:customStyle="1" w:styleId="NormalTok" w:type="character">
     <w:name w:val="NormalTok"/>
     <w:basedOn w:val="VerbatimChar"/>
     <w:rPr/>

</xml_diff>

<commit_message>
Docs: retake the Settings window screenshots after the label fixes
- FT-817 manual: Settings window with the FT-817 profile.
- 操作説明書: add the Settings window with an IC-7300 network profile.
- Regenerate the PDF and Word versions.

Co-Authored-By: Claude Opus 5.5 <noreply@anthropic.com>
</commit_message>
<xml_diff>
--- a/docs/wfview-mac_操作説明書.docx
+++ b/docs/wfview-mac_操作説明書.docx
@@ -376,6 +376,58 @@
           <w:sz w:val="21"/>
         </w:rPr>
         <w:t xml:space="preserve"> に変わります。押すと無線機から切断し、メイン画面を閉じて設定画面に戻ります。</w:t>
+      </w:r>
+    </w:p>
+    <w:p>
+      <w:pPr>
+        <w:jc w:val="center"/>
+      </w:pPr>
+      <w:r>
+        <w:drawing>
+          <wp:inline xmlns:a="http://schemas.openxmlformats.org/drawingml/2006/main" xmlns:pic="http://schemas.openxmlformats.org/drawingml/2006/picture">
+            <wp:extent cx="6120000" cy="3710250"/>
+            <wp:docPr id="1" name="Picture 1"/>
+            <wp:cNvGraphicFramePr>
+              <a:graphicFrameLocks noChangeAspect="1"/>
+            </wp:cNvGraphicFramePr>
+            <a:graphic>
+              <a:graphicData uri="http://schemas.openxmlformats.org/drawingml/2006/picture">
+                <pic:pic>
+                  <pic:nvPicPr>
+                    <pic:cNvPr id="0" name="settings-icom.png"/>
+                    <pic:cNvPicPr/>
+                  </pic:nvPicPr>
+                  <pic:blipFill>
+                    <a:blip r:embed="rId9"/>
+                    <a:stretch>
+                      <a:fillRect/>
+                    </a:stretch>
+                  </pic:blipFill>
+                  <pic:spPr>
+                    <a:xfrm>
+                      <a:off x="0" y="0"/>
+                      <a:ext cx="6120000" cy="3710250"/>
+                    </a:xfrm>
+                    <a:prstGeom prst="rect"/>
+                  </pic:spPr>
+                </pic:pic>
+              </a:graphicData>
+            </a:graphic>
+          </wp:inline>
+        </w:drawing>
+      </w:r>
+    </w:p>
+    <w:p>
+      <w:pPr>
+        <w:jc w:val="center"/>
+      </w:pPr>
+      <w:r>
+        <w:rPr>
+          <w:rFonts w:ascii="Helvetica Neue" w:hAnsi="Helvetica Neue" w:eastAsia="Hiragino Sans"/>
+          <w:color w:val="595959"/>
+          <w:sz w:val="18"/>
+        </w:rPr>
+        <w:t>設定画面（IC-7300 をネットワーク接続する設定）</w:t>
       </w:r>
     </w:p>
     <w:p>

</xml_diff>